<commit_message>
Added a cell to visualise the items represented by each class. This is to help with answering some of the interpretation questions.
</commit_message>
<xml_diff>
--- a/Report.docx
+++ b/Report.docx
@@ -1092,7 +1092,6 @@
         </w:numPr>
       </w:pPr>
       <w:proofErr w:type="spellStart"/>
-      <w:proofErr w:type="gramStart"/>
       <w:r>
         <w:rPr>
           <w:b/>
@@ -1102,7 +1101,6 @@
         <w:t>transforms.ToTensor</w:t>
       </w:r>
       <w:proofErr w:type="spellEnd"/>
-      <w:proofErr w:type="gramEnd"/>
       <w:r>
         <w:rPr>
           <w:b/>
@@ -1124,7 +1122,6 @@
         </w:numPr>
       </w:pPr>
       <w:proofErr w:type="spellStart"/>
-      <w:proofErr w:type="gramStart"/>
       <w:r>
         <w:rPr>
           <w:b/>
@@ -1134,7 +1131,6 @@
         <w:t>transforms.Normalize</w:t>
       </w:r>
       <w:proofErr w:type="spellEnd"/>
-      <w:proofErr w:type="gramEnd"/>
       <w:r>
         <w:rPr>
           <w:b/>
@@ -1159,7 +1155,6 @@
         </w:numPr>
       </w:pPr>
       <w:proofErr w:type="spellStart"/>
-      <w:proofErr w:type="gramStart"/>
       <w:r>
         <w:rPr>
           <w:b/>
@@ -1169,7 +1164,6 @@
         <w:t>transforms.Lambda</w:t>
       </w:r>
       <w:proofErr w:type="spellEnd"/>
-      <w:proofErr w:type="gramEnd"/>
       <w:r>
         <w:rPr>
           <w:b/>
@@ -1179,7 +1173,6 @@
         <w:t xml:space="preserve">(lambda x: </w:t>
       </w:r>
       <w:proofErr w:type="spellStart"/>
-      <w:proofErr w:type="gramStart"/>
       <w:r>
         <w:rPr>
           <w:b/>
@@ -1189,7 +1182,6 @@
         <w:t>x.flatten</w:t>
       </w:r>
       <w:proofErr w:type="spellEnd"/>
-      <w:proofErr w:type="gramEnd"/>
       <w:r>
         <w:rPr>
           <w:b/>
@@ -1346,33 +1338,13 @@
     </w:p>
     <w:p>
       <w:r>
-        <w:t xml:space="preserve">Defined a </w:t>
-      </w:r>
-      <w:r>
-        <w:rPr>
-          <w:b/>
-          <w:bCs/>
-          <w:i/>
-          <w:iCs/>
-        </w:rPr>
-        <w:t>MultiLayerPerceptron</w:t>
-      </w:r>
-      <w:r>
-        <w:t xml:space="preserve"> class that inherits from the </w:t>
-      </w:r>
-      <w:proofErr w:type="spellStart"/>
-      <w:proofErr w:type="gramStart"/>
-      <w:r>
-        <w:rPr>
-          <w:b/>
-          <w:bCs/>
-        </w:rPr>
-        <w:t>nn.Module</w:t>
-      </w:r>
-      <w:proofErr w:type="spellEnd"/>
-      <w:proofErr w:type="gramEnd"/>
-      <w:r>
-        <w:t xml:space="preserve"> class, with its constructor taking in four arguments:</w:t>
+        <w:t>Defined the following</w:t>
+      </w:r>
+      <w:r>
+        <w:t xml:space="preserve"> classes and</w:t>
+      </w:r>
+      <w:r>
+        <w:t xml:space="preserve"> methods to help with model definition and model training:</w:t>
       </w:r>
     </w:p>
     <w:p>
@@ -1384,7 +1356,121 @@
         </w:numPr>
       </w:pPr>
       <w:r>
-        <w:t>The number of features of the input data</w:t>
+        <w:rPr>
+          <w:b/>
+          <w:bCs/>
+          <w:i/>
+          <w:iCs/>
+        </w:rPr>
+        <w:t>MultiLayerPerceptron</w:t>
+      </w:r>
+      <w:r>
+        <w:t>:</w:t>
+      </w:r>
+    </w:p>
+    <w:p>
+      <w:pPr>
+        <w:pStyle w:val="ListParagraph"/>
+        <w:numPr>
+          <w:ilvl w:val="1"/>
+          <w:numId w:val="2"/>
+        </w:numPr>
+      </w:pPr>
+      <w:r>
+        <w:t xml:space="preserve">The class inherits from the </w:t>
+      </w:r>
+      <w:proofErr w:type="spellStart"/>
+      <w:r>
+        <w:rPr>
+          <w:b/>
+          <w:bCs/>
+          <w:i/>
+          <w:iCs/>
+        </w:rPr>
+        <w:t>nn.Module</w:t>
+      </w:r>
+      <w:proofErr w:type="spellEnd"/>
+      <w:r>
+        <w:t xml:space="preserve"> class, with its constructor taking in four arguments: the number of features of the input data, the number of neurons in the first and second hidden layers respectively, and the number of classes.</w:t>
+      </w:r>
+    </w:p>
+    <w:p>
+      <w:pPr>
+        <w:pStyle w:val="ListParagraph"/>
+        <w:numPr>
+          <w:ilvl w:val="1"/>
+          <w:numId w:val="2"/>
+        </w:numPr>
+      </w:pPr>
+      <w:r>
+        <w:t xml:space="preserve">The class uses the </w:t>
+      </w:r>
+      <w:proofErr w:type="spellStart"/>
+      <w:r>
+        <w:rPr>
+          <w:b/>
+          <w:bCs/>
+          <w:i/>
+          <w:iCs/>
+        </w:rPr>
+        <w:t>nn.Linear</w:t>
+      </w:r>
+      <w:proofErr w:type="spellEnd"/>
+      <w:r>
+        <w:t xml:space="preserve"> module to compute logits f</w:t>
+      </w:r>
+      <w:r>
+        <w:t xml:space="preserve">or each layer and uses the </w:t>
+      </w:r>
+      <w:proofErr w:type="spellStart"/>
+      <w:r>
+        <w:rPr>
+          <w:b/>
+          <w:bCs/>
+          <w:i/>
+          <w:iCs/>
+        </w:rPr>
+        <w:t>nn.ReLU</w:t>
+      </w:r>
+      <w:proofErr w:type="spellEnd"/>
+      <w:r>
+        <w:t xml:space="preserve"> activation function for the first and second layer to account for non-linearity as the FashionMNIST dataset is not linearly separable.</w:t>
+      </w:r>
+    </w:p>
+    <w:p>
+      <w:pPr>
+        <w:pStyle w:val="ListParagraph"/>
+        <w:numPr>
+          <w:ilvl w:val="1"/>
+          <w:numId w:val="2"/>
+        </w:numPr>
+      </w:pPr>
+      <w:r>
+        <w:t xml:space="preserve">The class has the </w:t>
+      </w:r>
+      <w:r>
+        <w:rPr>
+          <w:b/>
+          <w:bCs/>
+          <w:i/>
+          <w:iCs/>
+        </w:rPr>
+        <w:t>forward</w:t>
+      </w:r>
+      <w:r>
+        <w:t xml:space="preserve"> method which does forward propagation for a batch of inputs and a </w:t>
+      </w:r>
+      <w:r>
+        <w:rPr>
+          <w:b/>
+          <w:bCs/>
+          <w:i/>
+          <w:iCs/>
+        </w:rPr>
+        <w:t>predict</w:t>
+      </w:r>
+      <w:r>
+        <w:t xml:space="preserve"> method that predicts the classes of the batch of inputs as the classes that maximises the logits.</w:t>
       </w:r>
     </w:p>
     <w:p>
@@ -1395,8 +1481,35 @@
           <w:numId w:val="2"/>
         </w:numPr>
       </w:pPr>
-      <w:r>
-        <w:t>The number of neurons in the first and second hidden layers respectively</w:t>
+      <w:proofErr w:type="spellStart"/>
+      <w:r>
+        <w:rPr>
+          <w:b/>
+          <w:bCs/>
+          <w:i/>
+          <w:iCs/>
+        </w:rPr>
+        <w:lastRenderedPageBreak/>
+        <w:t>set_determinisitc_seed</w:t>
+      </w:r>
+      <w:proofErr w:type="spellEnd"/>
+      <w:r>
+        <w:t xml:space="preserve"> </w:t>
+      </w:r>
+      <w:r>
+        <w:t>function:</w:t>
+      </w:r>
+    </w:p>
+    <w:p>
+      <w:pPr>
+        <w:pStyle w:val="ListParagraph"/>
+        <w:numPr>
+          <w:ilvl w:val="1"/>
+          <w:numId w:val="2"/>
+        </w:numPr>
+      </w:pPr>
+      <w:r>
+        <w:t xml:space="preserve"> to set seeds for all libraries that are used that generates things randomly to ensure deterministic behaviour. </w:t>
       </w:r>
     </w:p>
     <w:p>
@@ -1407,53 +1520,527 @@
           <w:numId w:val="2"/>
         </w:numPr>
       </w:pPr>
-      <w:r>
-        <w:t>The number of classes</w:t>
-      </w:r>
-    </w:p>
-    <w:p>
-      <w:r>
-        <w:t xml:space="preserve">The class </w:t>
-      </w:r>
-      <w:r>
-        <w:t xml:space="preserve">uses </w:t>
-      </w:r>
-      <w:r>
-        <w:t xml:space="preserve">the </w:t>
-      </w:r>
       <w:proofErr w:type="spellStart"/>
-      <w:proofErr w:type="gramStart"/>
-      <w:r>
-        <w:rPr>
-          <w:b/>
-          <w:bCs/>
-        </w:rPr>
-        <w:t>nn.Linear</w:t>
+      <w:r>
+        <w:rPr>
+          <w:b/>
+          <w:bCs/>
+          <w:i/>
+          <w:iCs/>
+        </w:rPr>
+        <w:t>train_model</w:t>
       </w:r>
       <w:proofErr w:type="spellEnd"/>
-      <w:proofErr w:type="gramEnd"/>
-      <w:r>
-        <w:t xml:space="preserve"> module to compute logits for each </w:t>
-      </w:r>
-      <w:r>
-        <w:t>layer and</w:t>
-      </w:r>
-      <w:r>
-        <w:t xml:space="preserve"> uses </w:t>
-      </w:r>
+      <w:r>
+        <w:t xml:space="preserve"> </w:t>
+      </w:r>
+      <w:r>
+        <w:t>function:</w:t>
+      </w:r>
+    </w:p>
+    <w:p>
+      <w:pPr>
+        <w:pStyle w:val="ListParagraph"/>
+        <w:numPr>
+          <w:ilvl w:val="1"/>
+          <w:numId w:val="2"/>
+        </w:numPr>
+      </w:pPr>
+      <w:r>
+        <w:t xml:space="preserve"> that trains the model, keeps track training and validation losses, keeps track of training and validation accuracy, returns </w:t>
+      </w:r>
+      <w:r>
+        <w:t xml:space="preserve">a dictionary of the tracked metrics and the trained model. </w:t>
+      </w:r>
+    </w:p>
+    <w:p>
+      <w:pPr>
+        <w:pStyle w:val="ListParagraph"/>
+        <w:numPr>
+          <w:ilvl w:val="0"/>
+          <w:numId w:val="2"/>
+        </w:numPr>
+      </w:pPr>
       <w:proofErr w:type="spellStart"/>
-      <w:proofErr w:type="gramStart"/>
-      <w:r>
-        <w:rPr>
-          <w:b/>
-          <w:bCs/>
-        </w:rPr>
-        <w:t>nn.ReLU</w:t>
+      <w:r>
+        <w:rPr>
+          <w:b/>
+          <w:bCs/>
+          <w:i/>
+          <w:iCs/>
+        </w:rPr>
+        <w:t>get_final_metrics</w:t>
       </w:r>
       <w:proofErr w:type="spellEnd"/>
-      <w:proofErr w:type="gramEnd"/>
-      <w:r>
-        <w:t xml:space="preserve"> as activation functions for the first and second hidden layers. This is account for non-linearity as the FashionMNIST dataset is not linearly separable. The forward method of the class takes in a batch of inputs, does forward propagation and </w:t>
+      <w:r>
+        <w:t xml:space="preserve"> </w:t>
+      </w:r>
+      <w:r>
+        <w:t>function:</w:t>
+      </w:r>
+    </w:p>
+    <w:p>
+      <w:pPr>
+        <w:pStyle w:val="ListParagraph"/>
+        <w:numPr>
+          <w:ilvl w:val="1"/>
+          <w:numId w:val="2"/>
+        </w:numPr>
+      </w:pPr>
+      <w:r>
+        <w:t xml:space="preserve"> to compute the final training and validation accuracy from the trained MultiLayerPerceptron model. </w:t>
+      </w:r>
+    </w:p>
+    <w:p>
+      <w:r>
+        <w:t>Define</w:t>
+      </w:r>
+      <w:r>
+        <w:t>d</w:t>
+      </w:r>
+      <w:r>
+        <w:t xml:space="preserve"> a baseline model to train. The baseline</w:t>
+      </w:r>
+      <w:r>
+        <w:t xml:space="preserve"> </w:t>
+      </w:r>
+      <w:r>
+        <w:rPr>
+          <w:b/>
+          <w:bCs/>
+          <w:i/>
+          <w:iCs/>
+        </w:rPr>
+        <w:t>MultiLayerPerceptron</w:t>
+      </w:r>
+      <w:r>
+        <w:t xml:space="preserve"> model </w:t>
+      </w:r>
+      <w:r>
+        <w:t xml:space="preserve">assumes that data has 784 features (28x28 image pixels), 128 neurons for the first hidden layer, 64 neurons for the second hidden layer and 10 classes. Trained the model with the loss function as the </w:t>
+      </w:r>
+      <w:proofErr w:type="spellStart"/>
+      <w:r>
+        <w:rPr>
+          <w:b/>
+          <w:bCs/>
+          <w:i/>
+          <w:iCs/>
+        </w:rPr>
+        <w:t>nn.CrossEntropyLoss</w:t>
+      </w:r>
+      <w:proofErr w:type="spellEnd"/>
+      <w:r>
+        <w:rPr>
+          <w:b/>
+          <w:bCs/>
+          <w:i/>
+          <w:iCs/>
+        </w:rPr>
+        <w:t>()</w:t>
+      </w:r>
+      <w:r>
+        <w:t xml:space="preserve"> and the optimiser as </w:t>
+      </w:r>
+      <w:proofErr w:type="spellStart"/>
+      <w:r>
+        <w:rPr>
+          <w:b/>
+          <w:bCs/>
+          <w:i/>
+          <w:iCs/>
+        </w:rPr>
+        <w:t>t.optim.Adam</w:t>
+      </w:r>
+      <w:proofErr w:type="spellEnd"/>
+      <w:r>
+        <w:rPr>
+          <w:b/>
+          <w:bCs/>
+          <w:i/>
+          <w:iCs/>
+        </w:rPr>
+        <w:t>()</w:t>
+      </w:r>
+      <w:r>
+        <w:t xml:space="preserve"> with the learning rate = 0.001.</w:t>
+      </w:r>
+    </w:p>
+    <w:p>
+      <w:r>
+        <w:t>The final training accuracy achieved was around 92% and the final validation accuracy was around 8</w:t>
+      </w:r>
+      <w:r>
+        <w:t>8</w:t>
+      </w:r>
+      <w:r>
+        <w:t xml:space="preserve">%. This shows that the model is the right model for the dataset, and it learns the underlying patterns extremely well. The training results can be found </w:t>
+      </w:r>
+      <w:hyperlink r:id="rId8" w:history="1">
+        <w:r>
+          <w:rPr>
+            <w:rStyle w:val="Hyperlink"/>
+          </w:rPr>
+          <w:t>here</w:t>
+        </w:r>
+      </w:hyperlink>
+      <w:r>
+        <w:t>.</w:t>
+      </w:r>
+    </w:p>
+    <w:p>
+      <w:pPr>
+        <w:pStyle w:val="Heading2"/>
+        <w:numPr>
+          <w:ilvl w:val="0"/>
+          <w:numId w:val="1"/>
+        </w:numPr>
+      </w:pPr>
+      <w:r>
+        <w:t>Hyperparameter Optimisation Experiment</w:t>
+      </w:r>
+    </w:p>
+    <w:p>
+      <w:r>
+        <w:t xml:space="preserve">Defined the </w:t>
+      </w:r>
+      <w:proofErr w:type="spellStart"/>
+      <w:r>
+        <w:rPr>
+          <w:b/>
+          <w:bCs/>
+          <w:i/>
+          <w:iCs/>
+        </w:rPr>
+        <w:t>grid_search</w:t>
+      </w:r>
+      <w:proofErr w:type="spellEnd"/>
+      <w:r>
+        <w:t xml:space="preserve"> method that takes in a list of learning rates, list of optimisers, and a list of neurons to implement </w:t>
+      </w:r>
+      <w:r>
+        <w:t xml:space="preserve">a grid search to find the optimum hyperparameters (the ones that maximises the validation accuracy). The set of learning rates are [0.0001, 0.001, 0.01, 0.1], the set of optimisers are [“Adam”, “SGD”, “RMSprop”] and the set of neurons are [100, 150, 200, 250]. The models are defined with the </w:t>
+      </w:r>
+      <w:proofErr w:type="spellStart"/>
+      <w:r>
+        <w:rPr>
+          <w:b/>
+          <w:bCs/>
+          <w:i/>
+          <w:iCs/>
+        </w:rPr>
+        <w:t>nn.CrossEntropyLoss</w:t>
+      </w:r>
+      <w:proofErr w:type="spellEnd"/>
+      <w:r>
+        <w:rPr>
+          <w:b/>
+          <w:bCs/>
+          <w:i/>
+          <w:iCs/>
+        </w:rPr>
+        <w:t>()</w:t>
+      </w:r>
+      <w:r>
+        <w:t xml:space="preserve"> function as the loss function</w:t>
+      </w:r>
+      <w:r>
+        <w:t xml:space="preserve">. The </w:t>
+      </w:r>
+      <w:proofErr w:type="spellStart"/>
+      <w:r>
+        <w:rPr>
+          <w:b/>
+          <w:bCs/>
+          <w:i/>
+          <w:iCs/>
+        </w:rPr>
+        <w:t>grid_search</w:t>
+      </w:r>
+      <w:proofErr w:type="spellEnd"/>
+      <w:r>
+        <w:t xml:space="preserve"> function returns a list of training results for the hyperparameter combinations.</w:t>
+      </w:r>
+    </w:p>
+    <w:p>
+      <w:pPr>
+        <w:pStyle w:val="Heading2"/>
+        <w:numPr>
+          <w:ilvl w:val="0"/>
+          <w:numId w:val="1"/>
+        </w:numPr>
+      </w:pPr>
+      <w:r>
+        <w:t>Analysis and Report</w:t>
+      </w:r>
+    </w:p>
+    <w:p>
+      <w:r>
+        <w:t xml:space="preserve">To visualise the results of the </w:t>
+      </w:r>
+      <w:proofErr w:type="spellStart"/>
+      <w:r>
+        <w:rPr>
+          <w:b/>
+          <w:bCs/>
+          <w:i/>
+          <w:iCs/>
+        </w:rPr>
+        <w:t>grid_search</w:t>
+      </w:r>
+      <w:proofErr w:type="spellEnd"/>
+      <w:r>
+        <w:t xml:space="preserve">, I used the pandas </w:t>
+      </w:r>
+      <w:proofErr w:type="spellStart"/>
+      <w:r>
+        <w:rPr>
+          <w:b/>
+          <w:bCs/>
+          <w:i/>
+          <w:iCs/>
+        </w:rPr>
+        <w:t>dataframe</w:t>
+      </w:r>
+      <w:proofErr w:type="spellEnd"/>
+      <w:r>
+        <w:t xml:space="preserve"> to view the results in a table format. The </w:t>
+      </w:r>
+      <w:proofErr w:type="spellStart"/>
+      <w:r>
+        <w:rPr>
+          <w:b/>
+          <w:bCs/>
+          <w:i/>
+          <w:iCs/>
+        </w:rPr>
+        <w:t>dataframe</w:t>
+      </w:r>
+      <w:proofErr w:type="spellEnd"/>
+      <w:r>
+        <w:t xml:space="preserve"> was sorted in descending order of the validation accuracy. I also used a matplotlib </w:t>
+      </w:r>
+      <w:proofErr w:type="spellStart"/>
+      <w:r>
+        <w:rPr>
+          <w:b/>
+          <w:bCs/>
+          <w:i/>
+          <w:iCs/>
+        </w:rPr>
+        <w:t>barplot</w:t>
+      </w:r>
+      <w:proofErr w:type="spellEnd"/>
+      <w:r>
+        <w:t xml:space="preserve"> to visualise the results graphically, making it easier to spot the hyperparameter combinations that maximise validation accuracy. The hyperparameter combinations are on the y-axis with the validation accuracy on the x-axis. </w:t>
+      </w:r>
+    </w:p>
+    <w:p>
+      <w:r>
+        <w:t xml:space="preserve">To make the comparison of the baseline model and the </w:t>
+      </w:r>
+      <w:r>
+        <w:t xml:space="preserve">model that maximises the validation accuracy easier, I used a line graph to visualise the training and validation losses of the two models, the training and validation accuracies of the two models across different epochs on one plot. </w:t>
+      </w:r>
+    </w:p>
+    <w:p>
+      <w:r>
+        <w:t>Based on the grid results, Identified the best hyperparameter combinations as learning rate=0.001, optimiser =” Adam” and the neurons=200. Defined a new MultiLayerPerceptron model on these parameters, trained the model, predicted the classes for the validation dataset and plotted the confusion matrix of the true y-values vs the predicted y-values using a seaborn heatmap.</w:t>
+      </w:r>
+    </w:p>
+    <w:p>
+      <w:r>
+        <w:t>Interpretation of results:</w:t>
+      </w:r>
+    </w:p>
+    <w:p>
+      <w:r>
+        <w:t>Q: Which combination of hyperparameters produced the best model? How much did it improve upon the baseline accuracy?</w:t>
+      </w:r>
+    </w:p>
+    <w:p>
+      <w:pPr>
+        <w:pStyle w:val="ListParagraph"/>
+        <w:numPr>
+          <w:ilvl w:val="0"/>
+          <w:numId w:val="2"/>
+        </w:numPr>
+      </w:pPr>
+      <w:r>
+        <w:lastRenderedPageBreak/>
+        <w:t xml:space="preserve">The combination of hyperparameters that produced the best model was learning rate = 0.001, optimiser = </w:t>
+      </w:r>
+      <w:proofErr w:type="spellStart"/>
+      <w:r>
+        <w:t>t.optim.Adam</w:t>
+      </w:r>
+      <w:proofErr w:type="spellEnd"/>
+      <w:r>
+        <w:t xml:space="preserve"> and the number of neurons of the first hidden layer was 200. </w:t>
+      </w:r>
+    </w:p>
+    <w:p>
+      <w:pPr>
+        <w:pStyle w:val="ListParagraph"/>
+        <w:numPr>
+          <w:ilvl w:val="0"/>
+          <w:numId w:val="2"/>
+        </w:numPr>
+      </w:pPr>
+      <w:r>
+        <w:t>The improvement was not that significant, as the validation accuracy improved to 0.8850 from the baseline validation of 0.8833.</w:t>
+      </w:r>
+    </w:p>
+    <w:p>
+      <w:r>
+        <w:t>Q: Which hyperparameter had the most influence on performance? Explain why you think certain values worked better than others.</w:t>
+      </w:r>
+    </w:p>
+    <w:p>
+      <w:pPr>
+        <w:pStyle w:val="ListParagraph"/>
+        <w:numPr>
+          <w:ilvl w:val="0"/>
+          <w:numId w:val="2"/>
+        </w:numPr>
+      </w:pPr>
+      <w:r>
+        <w:t xml:space="preserve">The optimiser. Almost all hyperparameter combinations with </w:t>
+      </w:r>
+      <w:proofErr w:type="spellStart"/>
+      <w:r>
+        <w:t>t.optim.Adam</w:t>
+      </w:r>
+      <w:proofErr w:type="spellEnd"/>
+      <w:r>
+        <w:t xml:space="preserve"> as the optimiser produced the validation accuracies around 80s, while all the other optimisers produce</w:t>
+      </w:r>
+      <w:r>
+        <w:t>d accuracies below 10%.</w:t>
+      </w:r>
+    </w:p>
+    <w:p>
+      <w:pPr>
+        <w:pStyle w:val="ListParagraph"/>
+        <w:numPr>
+          <w:ilvl w:val="0"/>
+          <w:numId w:val="2"/>
+        </w:numPr>
+      </w:pPr>
+      <w:r>
+        <w:t>Adam’s core mechanism is its ability to compute adaptive learning rates for each individual parameter in the neural network, allowing it to navigate the loss landscape more effectively and typically converge faster than standard Stochastic Gradient Descent (SGD).</w:t>
+      </w:r>
+    </w:p>
+    <w:p>
+      <w:pPr>
+        <w:pStyle w:val="ListParagraph"/>
+        <w:numPr>
+          <w:ilvl w:val="0"/>
+          <w:numId w:val="2"/>
+        </w:numPr>
+      </w:pPr>
+      <w:r>
+        <w:t>Adam goes well with lower learning rates (like &lt;=0.01) as it allows it to make steady jumps towards the steepest gradient and faster convergence, but not too high like 0.1 as the algorithm will take huge steps towards the steepest gradient, potentially missing local minimum.</w:t>
+      </w:r>
+    </w:p>
+    <w:p>
+      <w:r>
+        <w:t>Q: By comparing the loss curves of your baseline and best models, analyse the degree of overfitting. Did you</w:t>
+      </w:r>
+      <w:r>
+        <w:t>r</w:t>
+      </w:r>
+      <w:r>
+        <w:t xml:space="preserve"> hyperparameter tuning help mitigate overfitting. </w:t>
+      </w:r>
+      <w:r>
+        <w:t>How can you tell from the plot.</w:t>
+      </w:r>
+    </w:p>
+    <w:p>
+      <w:pPr>
+        <w:pStyle w:val="ListParagraph"/>
+        <w:numPr>
+          <w:ilvl w:val="0"/>
+          <w:numId w:val="2"/>
+        </w:numPr>
+      </w:pPr>
+      <w:r>
+        <w:t>The degree of overfitting is not that large for both models. At most, the model’s difference between the training and validation losses is 0.1.</w:t>
+      </w:r>
+    </w:p>
+    <w:p>
+      <w:pPr>
+        <w:pStyle w:val="ListParagraph"/>
+        <w:numPr>
+          <w:ilvl w:val="0"/>
+          <w:numId w:val="2"/>
+        </w:numPr>
+      </w:pPr>
+      <w:r>
+        <w:t>The models start overfitting at around the 5</w:t>
+      </w:r>
+      <w:r>
+        <w:rPr>
+          <w:vertAlign w:val="superscript"/>
+        </w:rPr>
+        <w:t>th</w:t>
+      </w:r>
+      <w:r>
+        <w:t xml:space="preserve"> epoch.</w:t>
+      </w:r>
+    </w:p>
+    <w:p>
+      <w:pPr>
+        <w:pStyle w:val="ListParagraph"/>
+        <w:numPr>
+          <w:ilvl w:val="0"/>
+          <w:numId w:val="2"/>
+        </w:numPr>
+      </w:pPr>
+      <w:r>
+        <w:t>The best model’s training loss was consistently lower than that of the baseline model for all epochs.</w:t>
+      </w:r>
+    </w:p>
+    <w:p>
+      <w:pPr>
+        <w:pStyle w:val="ListParagraph"/>
+        <w:numPr>
+          <w:ilvl w:val="0"/>
+          <w:numId w:val="2"/>
+        </w:numPr>
+      </w:pPr>
+      <w:r>
+        <w:t>However, the best model seemed to increase the degree of overfitting instead of mitigating it.</w:t>
+      </w:r>
+    </w:p>
+    <w:p>
+      <w:pPr>
+        <w:pStyle w:val="ListParagraph"/>
+        <w:numPr>
+          <w:ilvl w:val="0"/>
+          <w:numId w:val="2"/>
+        </w:numPr>
+      </w:pPr>
+      <w:r>
+        <w:t>We can tell this from the plot, as the difference of the height between the train and validation loss of the baseline model is smaller than the difference of the height between the train and validation loss of the best model.</w:t>
+      </w:r>
+    </w:p>
+    <w:p>
+      <w:r>
+        <w:t>Q: Look at you confusion matrix. Identify two classes that the model frequently confuses. Propose a reason for this confusion by considering the visual characteristics of the characteristics of the items in those classes.</w:t>
+      </w:r>
+    </w:p>
+    <w:p>
+      <w:pPr>
+        <w:pStyle w:val="ListParagraph"/>
+        <w:numPr>
+          <w:ilvl w:val="0"/>
+          <w:numId w:val="2"/>
+        </w:numPr>
+      </w:pPr>
+      <w:r>
+        <w:t>The model is mostly accurate with its prediction, but it tends to confuse class 6 with class 0. This is supported by the large number of misclassifications between these two classes as compared to the misclassification of other classes.</w:t>
       </w:r>
     </w:p>
     <w:sectPr>
@@ -2622,6 +3209,29 @@
       <w14:ligatures w14:val="none"/>
     </w:rPr>
   </w:style>
+  <w:style w:type="character" w:styleId="Hyperlink">
+    <w:name w:val="Hyperlink"/>
+    <w:basedOn w:val="DefaultParagraphFont"/>
+    <w:uiPriority w:val="99"/>
+    <w:unhideWhenUsed/>
+    <w:rsid w:val="004C7325"/>
+    <w:rPr>
+      <w:color w:val="467886" w:themeColor="hyperlink"/>
+      <w:u w:val="single"/>
+    </w:rPr>
+  </w:style>
+  <w:style w:type="character" w:styleId="UnresolvedMention">
+    <w:name w:val="Unresolved Mention"/>
+    <w:basedOn w:val="DefaultParagraphFont"/>
+    <w:uiPriority w:val="99"/>
+    <w:semiHidden/>
+    <w:unhideWhenUsed/>
+    <w:rsid w:val="004C7325"/>
+    <w:rPr>
+      <w:color w:val="605E5C"/>
+      <w:shd w:val="clear" w:color="auto" w:fill="E1DFDD"/>
+    </w:rPr>
+  </w:style>
 </w:styles>
 </file>
 

</xml_diff>